<commit_message>
AASPCNJ01: confirma sobrenome do Arquiteto (Cézar Hiraki)
Aplica "Cézar Hiraki" nos 18 .md e na planilha; regenera os 18 .docx.
Índice -> v1.5; equipe completa. Mesma pessoa do projeto FTGASMIG.

https://claude.ai/code/session_01Lvzca1A5yJyk8RTZH29onh
</commit_message>
<xml_diff>
--- a/mps-nivel-c/oficial/04_registros/AASP_CNJ/PCP-AASPCNJ01-001_Documento-de-Design.docx
+++ b/mps-nivel-c/oficial/04_registros/AASP_CNJ/PCP-AASPCNJ01-001_Documento-de-Design.docx
@@ -394,7 +394,7 @@
                 <w:i w:val="0"/>
                 <w:sz w:val="20"/>
               </w:rPr>
-              <w:t>Cézar (Arquiteto) · Abraão Oliveira (GP / Tech Lead)</w:t>
+              <w:t>Cézar Hiraki (Arquiteto) · Abraão Oliveira (GP / Tech Lead)</w:t>
             </w:r>
           </w:p>
         </w:tc>
@@ -3853,7 +3853,7 @@
                 <w:i w:val="0"/>
                 <w:sz w:val="20"/>
               </w:rPr>
-              <w:t>Cézar / Raony Chagas</w:t>
+              <w:t>Cézar Hiraki / Raony Chagas</w:t>
             </w:r>
           </w:p>
         </w:tc>

</xml_diff>